<commit_message>
update structure for multi language
</commit_message>
<xml_diff>
--- a/docs/sweetpotato/sweetpotato-sop-en.docx
+++ b/docs/sweetpotato/sweetpotato-sop-en.docx
@@ -31,13 +31,43 @@
         <w:t xml:space="preserve"> </w:t>
       </w:r>
       <w:r>
+        <w:t xml:space="preserve">data</w:t>
+      </w:r>
+      <w:r>
+        <w:t xml:space="preserve"> </w:t>
+      </w:r>
+      <w:r>
+        <w:t xml:space="preserve">collection</w:t>
+      </w:r>
+      <w:r>
+        <w:t xml:space="preserve"> </w:t>
+      </w:r>
+      <w:r>
+        <w:t xml:space="preserve">and</w:t>
+      </w:r>
+      <w:r>
+        <w:t xml:space="preserve"> </w:t>
+      </w:r>
+      <w:r>
+        <w:t xml:space="preserve">implementation</w:t>
+      </w:r>
+      <w:r>
+        <w:t xml:space="preserve"> </w:t>
+      </w:r>
+      <w:r>
+        <w:t xml:space="preserve">of</w:t>
+      </w:r>
+      <w:r>
+        <w:t xml:space="preserve"> </w:t>
+      </w:r>
+      <w:r>
         <w:t xml:space="preserve">on-farm</w:t>
       </w:r>
       <w:r>
         <w:t xml:space="preserve"> </w:t>
       </w:r>
       <w:r>
-        <w:t xml:space="preserve">testing</w:t>
+        <w:t xml:space="preserve">trials</w:t>
       </w:r>
       <w:r>
         <w:t xml:space="preserve"> </w:t>
@@ -67,13 +97,13 @@
         <w:t xml:space="preserve"> </w:t>
       </w:r>
       <w:r>
-        <w:t xml:space="preserve">Sweet</w:t>
+        <w:t xml:space="preserve">sweet</w:t>
       </w:r>
       <w:r>
         <w:t xml:space="preserve"> </w:t>
       </w:r>
       <w:r>
-        <w:t xml:space="preserve">Potato</w:t>
+        <w:t xml:space="preserve">potato</w:t>
       </w:r>
     </w:p>
     <w:p>
@@ -107,7 +137,7 @@
         <w:t xml:space="preserve"> </w:t>
       </w:r>
       <w:r>
-        <w:t xml:space="preserve">Sweet Potato</w:t>
+        <w:t xml:space="preserve">sweet potato</w:t>
       </w:r>
       <w:r>
         <w:br/>
@@ -198,6 +228,22 @@
       </w:r>
       <w:r>
         <w:t xml:space="preserve">Participant registration form, Socio-economic, Vegetative - Establishment, Vegetative - Stress tolerance, Harvest - Technician assessment, Harvest - Farmer assessment, Post-harvest - Food product evaluation</w:t>
+      </w:r>
+      <w:r>
+        <w:br/>
+      </w:r>
+      <w:r>
+        <w:rPr>
+          <w:b/>
+          <w:bCs/>
+        </w:rPr>
+        <w:t xml:space="preserve">This document is also available in:</w:t>
+      </w:r>
+      <w:r>
+        <w:t xml:space="preserve"> </w:t>
+      </w:r>
+      <w:r>
+        <w:t xml:space="preserve">PT, FR, SW, ES</w:t>
       </w:r>
     </w:p>
     <w:p>
@@ -315,7 +361,7 @@
         <w:pStyle w:val="FirstParagraph"/>
       </w:pPr>
       <w:r>
-        <w:t xml:space="preserve">This informed consent form provides a standardised framework to ensure that all participants are adequately informed before taking part in the experiment and associated surveys. It explains the purpose of the data collection, the types of information that will be collected, and how these data may be used, including for research and publication. Participation is entirely voluntary. Participants may decline to answer any question or withdraw from the study at any time, without any negative consequences. Consent is obtained before data collection to ensure transparency, ethical research practice, and respect for participants’ rights. Providing informed consent is a prerequisite for inclusion in all subsequent trial and survey activities. Informed consent template is appended to this SOP.</w:t>
+        <w:t xml:space="preserve">The informed consent form provides a standardized framework to ensure that all participants are adequately informed before taking part in the experiment and associated surveys. It explains the purpose of the data collection, the types of information that will be collected, and how these data may be used, including for research and publication. Participation is entirely voluntary. Participants may decline to answer any question or withdraw from the study at any time, without any negative consequences. Consent is obtained before data collection to ensure transparency, ethical research practice, and respect for participants’ rights. Providing informed consent is a prerequisite for inclusion in all subsequent trial and survey activities. Informed consent template is appended to this SOP.</w:t>
       </w:r>
     </w:p>
     <w:bookmarkEnd w:id="23"/>
@@ -461,33 +507,17 @@
         <w:pStyle w:val="FirstParagraph"/>
       </w:pPr>
       <w:r>
-        <w:t xml:space="preserve">Participant registration is conducted during the distribution of trial packages and should be completed for all participants before any subsequent data collection activities can take place. Trial packages should be distributed sufficiently in advance of planting to allow participants adequate time for land preparation and trial establishment. The purpose of registration is to link each participant to a unique trial package and collect the minimum information required for trial management and participant follow-up. Registration activities should remain as brief and efficient as possible, as package distribution is often a busy activity during which project staff must distribute trial materials, explain trial procedures, answer participant questions, and provide implementation guidance.</w:t>
-      </w:r>
-      <w:r>
-        <w:t xml:space="preserve"> </w:t>
-      </w:r>
-      <w:r>
-        <w:rPr>
-          <w:b/>
-          <w:bCs/>
-        </w:rPr>
-        <w:t xml:space="preserve">Completion of participant registration is mandatory for inclusion in subsequent data collection activities and analyses.</w:t>
-      </w:r>
-      <w:r>
-        <w:t xml:space="preserve"> </w:t>
-      </w:r>
-      <w:r>
-        <w:t xml:space="preserve">During registration, project staff should explain the trial objectives, plot establishment procedures, observation schedule, and participant responsibilities throughout the duration of the trial.</w:t>
+        <w:t xml:space="preserve">Participant registration is conducted during the distribution of trial packages and should be completed for all participants before any subsequent data collection activities can take place. Trial packages should be distributed sufficiently in advance of planting to allow participants adequate time for land preparation and trial establishment. The purpose of registration is to link each participant to a unique trial package and collect the minimum information required for trial management and participant follow-up. Registration activities should remain as brief and efficient as possible, as package distribution is often a busy activity during which project staff must distribute trial materials, explain trial procedures, answer participant questions, and provide implementation guidance. Completion of participant registration is mandatory for inclusion in subsequent data collection activities and analyses. During registration, project staff should explain the trial objectives, plot establishment procedures, observation schedule, and participant responsibilities throughout the duration of the trial.</w:t>
       </w:r>
     </w:p>
     <w:bookmarkEnd w:id="27"/>
-    <w:bookmarkStart w:id="28" w:name="socio-economic-data"/>
+    <w:bookmarkStart w:id="28" w:name="socio-economic-survey"/>
     <w:p>
       <w:pPr>
         <w:pStyle w:val="Heading1"/>
       </w:pPr>
       <w:r>
-        <w:t xml:space="preserve">Socio-economic data</w:t>
+        <w:t xml:space="preserve">Socio-economic survey</w:t>
       </w:r>
     </w:p>
     <w:p>
@@ -3333,11 +3363,6 @@
         </w:tc>
       </w:tr>
     </w:tbl>
-    <w:p>
-      <w:r>
-        <w:br w:type="page"/>
-      </w:r>
-    </w:p>
     <w:bookmarkEnd w:id="43"/>
     <w:sectPr>
       <w:headerReference r:id="rId9" w:type="default"/>

</xml_diff>